<commit_message>
Place GitHub source link prominently on the report cover.
</commit_message>
<xml_diff>
--- a/docs/reports/EthiMatch_Project_Report.docx
+++ b/docs/reports/EthiMatch_Project_Report.docx
@@ -60,6 +60,28 @@
         <w:t>A Neuro-Symbolic AI System for</w:t>
         <w:br/>
         <w:t>Clinical-Trial Matching</w:t>
+      </w:r>
+    </w:p>
+    <w:p>
+      <w:pPr>
+        <w:spacing w:before="200" w:after="120"/>
+        <w:jc w:val="center"/>
+      </w:pPr>
+      <w:r>
+        <w:rPr>
+          <w:rFonts w:ascii="Calibri" w:hAnsi="Calibri"/>
+          <w:color w:val="0B2447"/>
+          <w:sz w:val="24"/>
+        </w:rPr>
+        <w:t xml:space="preserve">Source code: </w:t>
+      </w:r>
+      <w:r>
+        <w:rPr>
+          <w:rFonts w:ascii="Calibri" w:hAnsi="Calibri"/>
+          <w:color w:val="19A7CE"/>
+          <w:sz w:val="24"/>
+        </w:rPr>
+        <w:t>https://github.com/Vrajpro/EthiMatch</w:t>
       </w:r>
     </w:p>
     <w:p/>
@@ -396,42 +418,6 @@
                 <w:sz w:val="20"/>
               </w:rPr>
               <w:t>PDF only (Turnitin)</w:t>
-            </w:r>
-          </w:p>
-        </w:tc>
-      </w:tr>
-      <w:tr>
-        <w:tc>
-          <w:tcPr>
-            <w:tcW w:type="dxa" w:w="4680"/>
-            <w:shd w:val="clear" w:color="auto" w:fill="F5F7FA"/>
-          </w:tcPr>
-          <w:p>
-            <w:r/>
-            <w:r>
-              <w:rPr>
-                <w:rFonts w:ascii="Calibri" w:hAnsi="Calibri"/>
-                <w:color w:val="0B2447"/>
-                <w:sz w:val="20"/>
-              </w:rPr>
-              <w:t>Source code</w:t>
-            </w:r>
-          </w:p>
-        </w:tc>
-        <w:tc>
-          <w:tcPr>
-            <w:tcW w:type="dxa" w:w="4680"/>
-            <w:shd w:val="clear" w:color="auto" w:fill="F5F7FA"/>
-          </w:tcPr>
-          <w:p>
-            <w:r/>
-            <w:r>
-              <w:rPr>
-                <w:rFonts w:ascii="Calibri" w:hAnsi="Calibri"/>
-                <w:color w:val="0B2447"/>
-                <w:sz w:val="20"/>
-              </w:rPr>
-              <w:t>https://github.com/Vrajpro/EthiMatch</w:t>
             </w:r>
           </w:p>
         </w:tc>

</xml_diff>

<commit_message>
Add examiner Q&A file and link it from the report cover and README.
</commit_message>
<xml_diff>
--- a/docs/reports/EthiMatch_Project_Report.docx
+++ b/docs/reports/EthiMatch_Project_Report.docx
@@ -82,6 +82,28 @@
           <w:sz w:val="24"/>
         </w:rPr>
         <w:t>https://github.com/Vrajpro/EthiMatch</w:t>
+      </w:r>
+    </w:p>
+    <w:p>
+      <w:pPr>
+        <w:spacing w:after="80"/>
+        <w:jc w:val="center"/>
+      </w:pPr>
+      <w:r>
+        <w:rPr>
+          <w:rFonts w:ascii="Calibri" w:hAnsi="Calibri"/>
+          <w:color w:val="0B2447"/>
+          <w:sz w:val="22"/>
+        </w:rPr>
+        <w:t xml:space="preserve">Examiner Q&amp;A (if any questions arise while reading this PDF): </w:t>
+      </w:r>
+      <w:r>
+        <w:rPr>
+          <w:rFonts w:ascii="Calibri" w:hAnsi="Calibri"/>
+          <w:color w:val="19A7CE"/>
+          <w:sz w:val="22"/>
+        </w:rPr>
+        <w:t>https://github.com/Vrajpro/EthiMatch/blob/main/docs/EXAMINER_FAQ.md</w:t>
       </w:r>
     </w:p>
     <w:p/>

</xml_diff>